<commit_message>
API documentada ruta por ruta, y dos hallazgos criticos de control de acceso
docs/03_DESARROLLO/API.md con todos los endpoints, su middleware y el rol que
exigen. Informe de auditoria a v1.1 y analisis de seguridad corregido. PDF y
DOCX regenerados.

La revision ruta por ruta destapo lo que la primera pasada no vio: se habia
revisado configuracion, puertos, secretos, Docker y respaldos, pero no QUE
MIDDLEWARE APLICA CADA RUTA ni que hace cada controlador. Lo estructural
estaba bien; la falla estaba dentro del codigo.

Verificado con peticiones reales contra produccion, sin modificar datos.
</commit_message>
<xml_diff>
--- a/INFORME_AUDITORIA.docx
+++ b/INFORME_AUDITORIA.docx
@@ -127,7 +127,7 @@
         <w:t xml:space="preserve"> </w:t>
       </w:r>
       <w:r>
-        <w:t xml:space="preserve">1.0</w:t>
+        <w:t xml:space="preserve">1.1</w:t>
       </w:r>
       <w:r>
         <w:t xml:space="preserve"> </w:t>
@@ -223,7 +223,7 @@
         <w:t xml:space="preserve"> </w:t>
       </w:r>
       <w:r>
-        <w:t xml:space="preserve">1.0</w:t>
+        <w:t xml:space="preserve">1.1 (revision ampliada)</w:t>
       </w:r>
       <w:r>
         <w:t xml:space="preserve"> </w:t>
@@ -396,12 +396,134 @@
         <w:t xml:space="preserve">version del APK no debe repartirse.</w:t>
       </w:r>
     </w:p>
+    <w:bookmarkEnd w:id="20"/>
+    <w:bookmarkStart w:id="21" w:name="correccion-de-la-version-1.0"/>
+    <w:p>
+      <w:pPr>
+        <w:pStyle w:val="Heading2"/>
+      </w:pPr>
+      <w:r>
+        <w:rPr>
+          <w:rStyle w:val="SectionNumber"/>
+        </w:rPr>
+        <w:t xml:space="preserve">0.2</w:t>
+      </w:r>
+      <w:r>
+        <w:tab/>
+      </w:r>
+      <w:r>
+        <w:t xml:space="preserve">⚠️ Correccion de la version 1.0</w:t>
+      </w:r>
+    </w:p>
+    <w:p>
+      <w:pPr>
+        <w:pStyle w:val="FirstParagraph"/>
+      </w:pPr>
+      <w:r>
+        <w:t xml:space="preserve">La documentacion de la API ruta por ruta destapo</w:t>
+      </w:r>
+      <w:r>
+        <w:t xml:space="preserve"> </w:t>
+      </w:r>
+      <w:r>
+        <w:rPr>
+          <w:b/>
+          <w:bCs/>
+        </w:rPr>
+        <w:t xml:space="preserve">una toma de cuentas</w:t>
+      </w:r>
+      <w:r>
+        <w:t xml:space="preserve"> </w:t>
+      </w:r>
+      <w:r>
+        <w:t xml:space="preserve">que la</w:t>
+      </w:r>
+      <w:r>
+        <w:t xml:space="preserve"> </w:t>
+      </w:r>
+      <w:r>
+        <w:t xml:space="preserve">primera pasada no vio:</w:t>
+      </w:r>
+      <w:r>
+        <w:t xml:space="preserve"> </w:t>
+      </w:r>
+      <w:r>
+        <w:rPr>
+          <w:rStyle w:val="VerbatimChar"/>
+        </w:rPr>
+        <w:t xml:space="preserve">POST /api/procesar_paswchg</w:t>
+      </w:r>
+      <w:r>
+        <w:t xml:space="preserve"> </w:t>
+      </w:r>
+      <w:r>
+        <w:t xml:space="preserve">es publico y</w:t>
+      </w:r>
+      <w:r>
+        <w:t xml:space="preserve"> </w:t>
+      </w:r>
+      <w:r>
+        <w:rPr>
+          <w:b/>
+          <w:bCs/>
+        </w:rPr>
+        <w:t xml:space="preserve">cambia la</w:t>
+      </w:r>
+      <w:r>
+        <w:rPr>
+          <w:b/>
+          <w:bCs/>
+        </w:rPr>
+        <w:t xml:space="preserve"> </w:t>
+      </w:r>
+      <w:r>
+        <w:rPr>
+          <w:b/>
+          <w:bCs/>
+        </w:rPr>
+        <w:t xml:space="preserve">contrasena de cualquier usuario sin validar ningun token</w:t>
+      </w:r>
+      <w:r>
+        <w:t xml:space="preserve">. Basta el</w:t>
+      </w:r>
+      <w:r>
+        <w:t xml:space="preserve"> </w:t>
+      </w:r>
+      <w:r>
+        <w:rPr>
+          <w:rStyle w:val="VerbatimChar"/>
+        </w:rPr>
+        <w:t xml:space="preserve">user_id</w:t>
+      </w:r>
+      <w:r>
+        <w:t xml:space="preserve">,</w:t>
+      </w:r>
+      <w:r>
+        <w:t xml:space="preserve"> </w:t>
+      </w:r>
+      <w:r>
+        <w:t xml:space="preserve">que es un entero secuencial.</w:t>
+      </w:r>
+    </w:p>
     <w:p>
       <w:pPr>
         <w:pStyle w:val="BodyText"/>
       </w:pPr>
       <w:r>
-        <w:t xml:space="preserve">El problema es de exposicion, y es grave:</w:t>
+        <w:t xml:space="preserve">Eso desplaza la prioridad:</w:t>
+      </w:r>
+      <w:r>
+        <w:t xml:space="preserve"> </w:t>
+      </w:r>
+      <w:r>
+        <w:rPr>
+          <w:b/>
+          <w:bCs/>
+        </w:rPr>
+        <w:t xml:space="preserve">por delante incluso de activar HTTPS</w:t>
+      </w:r>
+      <w:r>
+        <w:t xml:space="preserve">.</w:t>
       </w:r>
     </w:p>
     <w:p>
@@ -409,11 +531,152 @@
         <w:pStyle w:val="BodyText"/>
       </w:pPr>
       <w:r>
-        <w:rPr>
-          <w:b/>
-          <w:bCs/>
-        </w:rPr>
-        <w:t xml:space="preserve">Datos biometricos de 880 personas viajan por internet sin cifrar.</w:t>
+        <w:t xml:space="preserve">La primera pasada reviso configuracion, exposicion, Docker y secretos. Lo que</w:t>
+      </w:r>
+      <w:r>
+        <w:t xml:space="preserve"> </w:t>
+      </w:r>
+      <w:r>
+        <w:t xml:space="preserve">no reviso fue el codigo de cada controlador.</w:t>
+      </w:r>
+    </w:p>
+    <w:bookmarkEnd w:id="21"/>
+    <w:bookmarkStart w:id="22" w:name="el-problema-ahora-en-dos-frentes"/>
+    <w:p>
+      <w:pPr>
+        <w:pStyle w:val="Heading2"/>
+      </w:pPr>
+      <w:r>
+        <w:rPr>
+          <w:rStyle w:val="SectionNumber"/>
+        </w:rPr>
+        <w:t xml:space="preserve">0.3</w:t>
+      </w:r>
+      <w:r>
+        <w:tab/>
+      </w:r>
+      <w:r>
+        <w:t xml:space="preserve">El problema, ahora en dos frentes</w:t>
+      </w:r>
+    </w:p>
+    <w:p>
+      <w:pPr>
+        <w:pStyle w:val="FirstParagraph"/>
+      </w:pPr>
+      <w:r>
+        <w:rPr>
+          <w:b/>
+          <w:bCs/>
+        </w:rPr>
+        <w:t xml:space="preserve">Primero: cualquiera puede tomar cualquier cuenta.</w:t>
+      </w:r>
+      <w:r>
+        <w:t xml:space="preserve"> </w:t>
+      </w:r>
+      <w:r>
+        <w:rPr>
+          <w:rStyle w:val="VerbatimChar"/>
+        </w:rPr>
+        <w:t xml:space="preserve">POST /api/procesar_paswchg</w:t>
+      </w:r>
+      <w:r>
+        <w:t xml:space="preserve"> </w:t>
+      </w:r>
+      <w:r>
+        <w:t xml:space="preserve">no exige autenticacion y no comprueba el token de recuperacion que el propio</w:t>
+      </w:r>
+      <w:r>
+        <w:t xml:space="preserve"> </w:t>
+      </w:r>
+      <w:r>
+        <w:t xml:space="preserve">sistema emite. Una peticion con</w:t>
+      </w:r>
+      <w:r>
+        <w:t xml:space="preserve"> </w:t>
+      </w:r>
+      <w:r>
+        <w:rPr>
+          <w:rStyle w:val="VerbatimChar"/>
+        </w:rPr>
+        <w:t xml:space="preserve">{"user_id":1,"password":"...","password2":"..."}</w:t>
+      </w:r>
+      <w:r>
+        <w:t xml:space="preserve"> </w:t>
+      </w:r>
+      <w:r>
+        <w:t xml:space="preserve">cambia la contrasena de ese usuario. Y</w:t>
+      </w:r>
+      <w:r>
+        <w:t xml:space="preserve"> </w:t>
+      </w:r>
+      <w:r>
+        <w:rPr>
+          <w:rStyle w:val="VerbatimChar"/>
+        </w:rPr>
+        <w:t xml:space="preserve">POST /api/solicitud_paswchg</w:t>
+      </w:r>
+      <w:r>
+        <w:t xml:space="preserve">, tambien</w:t>
+      </w:r>
+      <w:r>
+        <w:t xml:space="preserve"> </w:t>
+      </w:r>
+      <w:r>
+        <w:t xml:space="preserve">publico,</w:t>
+      </w:r>
+      <w:r>
+        <w:t xml:space="preserve"> </w:t>
+      </w:r>
+      <w:r>
+        <w:rPr>
+          <w:b/>
+          <w:bCs/>
+        </w:rPr>
+        <w:t xml:space="preserve">devuelve el token y el</w:t>
+      </w:r>
+      <w:r>
+        <w:rPr>
+          <w:b/>
+          <w:bCs/>
+        </w:rPr>
+        <w:t xml:space="preserve"> </w:t>
+      </w:r>
+      <w:r>
+        <w:rPr>
+          <w:rStyle w:val="VerbatimChar"/>
+          <w:b/>
+          <w:bCs/>
+        </w:rPr>
+        <w:t xml:space="preserve">user_id</w:t>
+      </w:r>
+      <w:r>
+        <w:rPr>
+          <w:b/>
+          <w:bCs/>
+        </w:rPr>
+        <w:t xml:space="preserve"> </w:t>
+      </w:r>
+      <w:r>
+        <w:rPr>
+          <w:b/>
+          <w:bCs/>
+        </w:rPr>
+        <w:t xml:space="preserve">en la respuesta</w:t>
+      </w:r>
+      <w:r>
+        <w:t xml:space="preserve">.</w:t>
+      </w:r>
+    </w:p>
+    <w:p>
+      <w:pPr>
+        <w:pStyle w:val="BodyText"/>
+      </w:pPr>
+      <w:r>
+        <w:rPr>
+          <w:b/>
+          <w:bCs/>
+        </w:rPr>
+        <w:t xml:space="preserve">Segundo: datos biometricos de 880 personas viajan por internet sin cifrar.</w:t>
       </w:r>
       <w:r>
         <w:t xml:space="preserve"> </w:t>
@@ -605,8 +868,8 @@
         <w:t xml:space="preserve">activarlo.</w:t>
       </w:r>
     </w:p>
-    <w:bookmarkEnd w:id="20"/>
-    <w:bookmarkStart w:id="21" w:name="estado-general"/>
+    <w:bookmarkEnd w:id="22"/>
+    <w:bookmarkStart w:id="23" w:name="estado-general"/>
     <w:p>
       <w:pPr>
         <w:pStyle w:val="Heading2"/>
@@ -615,7 +878,7 @@
         <w:rPr>
           <w:rStyle w:val="SectionNumber"/>
         </w:rPr>
-        <w:t xml:space="preserve">0.2</w:t>
+        <w:t xml:space="preserve">0.4</w:t>
       </w:r>
       <w:r>
         <w:tab/>
@@ -656,8 +919,8 @@
         <w:t xml:space="preserve">respaldo, no por la calidad de su construccion.</w:t>
       </w:r>
     </w:p>
-    <w:bookmarkEnd w:id="21"/>
-    <w:bookmarkStart w:id="22" w:name="arquitectura"/>
+    <w:bookmarkEnd w:id="23"/>
+    <w:bookmarkStart w:id="24" w:name="arquitectura"/>
     <w:p>
       <w:pPr>
         <w:pStyle w:val="Heading2"/>
@@ -666,7 +929,7 @@
         <w:rPr>
           <w:rStyle w:val="SectionNumber"/>
         </w:rPr>
-        <w:t xml:space="preserve">0.3</w:t>
+        <w:t xml:space="preserve">0.5</w:t>
       </w:r>
       <w:r>
         <w:tab/>
@@ -695,8 +958,8 @@
         <w:t xml:space="preserve">la base heredada V1.</w:t>
       </w:r>
     </w:p>
-    <w:bookmarkEnd w:id="22"/>
-    <w:bookmarkStart w:id="23" w:name="codigo"/>
+    <w:bookmarkEnd w:id="24"/>
+    <w:bookmarkStart w:id="25" w:name="codigo"/>
     <w:p>
       <w:pPr>
         <w:pStyle w:val="Heading2"/>
@@ -705,7 +968,7 @@
         <w:rPr>
           <w:rStyle w:val="SectionNumber"/>
         </w:rPr>
-        <w:t xml:space="preserve">0.4</w:t>
+        <w:t xml:space="preserve">0.6</w:t>
       </w:r>
       <w:r>
         <w:tab/>
@@ -734,8 +997,8 @@
         <w:t xml:space="preserve">modularizacion permite que la API movil evolucione sin arrastrar al portal.</w:t>
       </w:r>
     </w:p>
-    <w:bookmarkEnd w:id="23"/>
-    <w:bookmarkStart w:id="24" w:name="docker"/>
+    <w:bookmarkEnd w:id="25"/>
+    <w:bookmarkStart w:id="26" w:name="docker"/>
     <w:p>
       <w:pPr>
         <w:pStyle w:val="Heading2"/>
@@ -744,7 +1007,7 @@
         <w:rPr>
           <w:rStyle w:val="SectionNumber"/>
         </w:rPr>
-        <w:t xml:space="preserve">0.5</w:t>
+        <w:t xml:space="preserve">0.7</w:t>
       </w:r>
       <w:r>
         <w:tab/>
@@ -876,8 +1139,8 @@
         <w:t xml:space="preserve">.</w:t>
       </w:r>
     </w:p>
-    <w:bookmarkEnd w:id="24"/>
-    <w:bookmarkStart w:id="25" w:name="base-de-datos"/>
+    <w:bookmarkEnd w:id="26"/>
+    <w:bookmarkStart w:id="27" w:name="base-de-datos"/>
     <w:p>
       <w:pPr>
         <w:pStyle w:val="Heading2"/>
@@ -886,7 +1149,7 @@
         <w:rPr>
           <w:rStyle w:val="SectionNumber"/>
         </w:rPr>
-        <w:t xml:space="preserve">0.6</w:t>
+        <w:t xml:space="preserve">0.8</w:t>
       </w:r>
       <w:r>
         <w:tab/>
@@ -948,8 +1211,8 @@
         <w:t xml:space="preserve">: es el trabajo pendiente mas grande.</w:t>
       </w:r>
     </w:p>
-    <w:bookmarkEnd w:id="25"/>
-    <w:bookmarkStart w:id="26" w:name="seguridad"/>
+    <w:bookmarkEnd w:id="27"/>
+    <w:bookmarkStart w:id="28" w:name="seguridad"/>
     <w:p>
       <w:pPr>
         <w:pStyle w:val="Heading2"/>
@@ -958,7 +1221,7 @@
         <w:rPr>
           <w:rStyle w:val="SectionNumber"/>
         </w:rPr>
-        <w:t xml:space="preserve">0.7</w:t>
+        <w:t xml:space="preserve">0.9</w:t>
       </w:r>
       <w:r>
         <w:tab/>
@@ -972,11 +1235,78 @@
         <w:pStyle w:val="FirstParagraph"/>
       </w:pPr>
       <w:r>
-        <w:t xml:space="preserve">1 critico, 2 altos, 3 medios. El critico es la exposicion sin cifrar.</w:t>
-      </w:r>
-    </w:p>
-    <w:bookmarkEnd w:id="26"/>
-    <w:bookmarkStart w:id="27" w:name="documentacion"/>
+        <w:rPr>
+          <w:b/>
+          <w:bCs/>
+        </w:rPr>
+        <w:t xml:space="preserve">2 criticos</w:t>
+      </w:r>
+      <w:r>
+        <w:t xml:space="preserve">, 2 altos, 4 medios. El primero es la toma de cuentas; el segundo,</w:t>
+      </w:r>
+      <w:r>
+        <w:t xml:space="preserve"> </w:t>
+      </w:r>
+      <w:r>
+        <w:t xml:space="preserve">la exposicion sin cifrar.</w:t>
+      </w:r>
+    </w:p>
+    <w:p>
+      <w:pPr>
+        <w:pStyle w:val="BodyText"/>
+      </w:pPr>
+      <w:r>
+        <w:t xml:space="preserve">Lo que</w:t>
+      </w:r>
+      <w:r>
+        <w:t xml:space="preserve"> </w:t>
+      </w:r>
+      <w:r>
+        <w:rPr>
+          <w:b/>
+          <w:bCs/>
+        </w:rPr>
+        <w:t xml:space="preserve">si</w:t>
+      </w:r>
+      <w:r>
+        <w:t xml:space="preserve"> </w:t>
+      </w:r>
+      <w:r>
+        <w:t xml:space="preserve">esta bien resuelto: el login (Hash::check, estado, gestion y rol</w:t>
+      </w:r>
+      <w:r>
+        <w:t xml:space="preserve"> </w:t>
+      </w:r>
+      <w:r>
+        <w:t xml:space="preserve">antes de emitir el token), el webhook de WhatsApp (</w:t>
+      </w:r>
+      <w:r>
+        <w:rPr>
+          <w:rStyle w:val="VerbatimChar"/>
+        </w:rPr>
+        <w:t xml:space="preserve">hash_equals</w:t>
+      </w:r>
+      <w:r>
+        <w:t xml:space="preserve"> </w:t>
+      </w:r>
+      <w:r>
+        <w:t xml:space="preserve">y 404 sin</w:t>
+      </w:r>
+      <w:r>
+        <w:t xml:space="preserve"> </w:t>
+      </w:r>
+      <w:r>
+        <w:t xml:space="preserve">token configurado — la mejor implementacion del servidor), y que solo 4 de 55</w:t>
+      </w:r>
+      <w:r>
+        <w:t xml:space="preserve"> </w:t>
+      </w:r>
+      <w:r>
+        <w:t xml:space="preserve">rutas sean publicas.</w:t>
+      </w:r>
+    </w:p>
+    <w:bookmarkEnd w:id="28"/>
+    <w:bookmarkStart w:id="29" w:name="documentacion"/>
     <w:p>
       <w:pPr>
         <w:pStyle w:val="Heading2"/>
@@ -985,7 +1315,7 @@
         <w:rPr>
           <w:rStyle w:val="SectionNumber"/>
         </w:rPr>
-        <w:t xml:space="preserve">0.8</w:t>
+        <w:t xml:space="preserve">0.10</w:t>
       </w:r>
       <w:r>
         <w:tab/>
@@ -1058,8 +1388,8 @@
         <w:t xml:space="preserve">.</w:t>
       </w:r>
     </w:p>
-    <w:bookmarkEnd w:id="27"/>
-    <w:bookmarkStart w:id="28" w:name="backup"/>
+    <w:bookmarkEnd w:id="29"/>
+    <w:bookmarkStart w:id="30" w:name="backup"/>
     <w:p>
       <w:pPr>
         <w:pStyle w:val="Heading2"/>
@@ -1068,7 +1398,7 @@
         <w:rPr>
           <w:rStyle w:val="SectionNumber"/>
         </w:rPr>
-        <w:t xml:space="preserve">0.9</w:t>
+        <w:t xml:space="preserve">0.11</w:t>
       </w:r>
       <w:r>
         <w:tab/>
@@ -1117,8 +1447,8 @@
         <w:t xml:space="preserve">.</w:t>
       </w:r>
     </w:p>
-    <w:bookmarkEnd w:id="28"/>
-    <w:bookmarkStart w:id="29" w:name="operacion"/>
+    <w:bookmarkEnd w:id="30"/>
+    <w:bookmarkStart w:id="31" w:name="operacion"/>
     <w:p>
       <w:pPr>
         <w:pStyle w:val="Heading2"/>
@@ -1127,7 +1457,7 @@
         <w:rPr>
           <w:rStyle w:val="SectionNumber"/>
         </w:rPr>
-        <w:t xml:space="preserve">0.10</w:t>
+        <w:t xml:space="preserve">0.12</w:t>
       </w:r>
       <w:r>
         <w:tab/>
@@ -1144,8 +1474,8 @@
         <w:t xml:space="preserve">Unico sistema expuesto a internet. Sin monitoreo. Healthcheck solo en la base.</w:t>
       </w:r>
     </w:p>
-    <w:bookmarkEnd w:id="29"/>
-    <w:bookmarkStart w:id="30" w:name="mobile"/>
+    <w:bookmarkEnd w:id="31"/>
+    <w:bookmarkStart w:id="32" w:name="mobile"/>
     <w:p>
       <w:pPr>
         <w:pStyle w:val="Heading2"/>
@@ -1154,7 +1484,7 @@
         <w:rPr>
           <w:rStyle w:val="SectionNumber"/>
         </w:rPr>
-        <w:t xml:space="preserve">0.11</w:t>
+        <w:t xml:space="preserve">0.13</w:t>
       </w:r>
       <w:r>
         <w:tab/>
@@ -1268,8 +1598,8 @@
         <w:t xml:space="preserve">tablets fueron actualizadas.</w:t>
       </w:r>
     </w:p>
-    <w:bookmarkEnd w:id="30"/>
-    <w:bookmarkStart w:id="31" w:name="riesgos"/>
+    <w:bookmarkEnd w:id="32"/>
+    <w:bookmarkStart w:id="33" w:name="riesgos"/>
     <w:p>
       <w:pPr>
         <w:pStyle w:val="Heading2"/>
@@ -1278,7 +1608,7 @@
         <w:rPr>
           <w:rStyle w:val="SectionNumber"/>
         </w:rPr>
-        <w:t xml:space="preserve">0.12</w:t>
+        <w:t xml:space="preserve">0.14</w:t>
       </w:r>
       <w:r>
         <w:tab/>
@@ -1367,6 +1697,78 @@
                 <w:b/>
                 <w:bCs/>
               </w:rPr>
+              <w:t xml:space="preserve">Toma de cualquier cuenta, incluida la administrativa</w:t>
+            </w:r>
+          </w:p>
+        </w:tc>
+        <w:tc>
+          <w:tcPr/>
+          <w:p>
+            <w:pPr>
+              <w:pStyle w:val="Compact"/>
+              <w:jc w:val="left"/>
+            </w:pPr>
+            <w:r>
+              <w:rPr>
+                <w:b/>
+                <w:bCs/>
+              </w:rPr>
+              <w:t xml:space="preserve">alta</w:t>
+            </w:r>
+          </w:p>
+        </w:tc>
+        <w:tc>
+          <w:tcPr/>
+          <w:p>
+            <w:pPr>
+              <w:pStyle w:val="Compact"/>
+              <w:jc w:val="left"/>
+            </w:pPr>
+            <w:r>
+              <w:rPr>
+                <w:b/>
+                <w:bCs/>
+              </w:rPr>
+              <w:t xml:space="preserve">muy alto</w:t>
+            </w:r>
+          </w:p>
+        </w:tc>
+        <w:tc>
+          <w:tcPr/>
+          <w:p>
+            <w:pPr>
+              <w:pStyle w:val="Compact"/>
+              <w:jc w:val="left"/>
+            </w:pPr>
+            <w:r>
+              <w:rPr>
+                <w:b/>
+                <w:bCs/>
+              </w:rPr>
+              <w:t xml:space="preserve">muy alta</w:t>
+            </w:r>
+            <w:r>
+              <w:t xml:space="preserve"> </w:t>
+            </w:r>
+            <w:r>
+              <w:t xml:space="preserve">— endpoint publico en internet</w:t>
+            </w:r>
+          </w:p>
+        </w:tc>
+      </w:tr>
+      <w:tr>
+        <w:tc>
+          <w:tcPr/>
+          <w:p>
+            <w:pPr>
+              <w:pStyle w:val="Compact"/>
+              <w:jc w:val="left"/>
+            </w:pPr>
+            <w:r>
+              <w:rPr>
+                <w:b/>
+                <w:bCs/>
+              </w:rPr>
               <w:t xml:space="preserve">Interceptacion de biometria y credenciales</w:t>
             </w:r>
           </w:p>
@@ -1725,8 +2127,8 @@
         </w:tc>
       </w:tr>
     </w:tbl>
-    <w:bookmarkEnd w:id="31"/>
-    <w:bookmarkStart w:id="37" w:name="inconsistencias"/>
+    <w:bookmarkEnd w:id="33"/>
+    <w:bookmarkStart w:id="39" w:name="inconsistencias"/>
     <w:p>
       <w:pPr>
         <w:pStyle w:val="Heading2"/>
@@ -1735,7 +2137,7 @@
         <w:rPr>
           <w:rStyle w:val="SectionNumber"/>
         </w:rPr>
-        <w:t xml:space="preserve">0.13</w:t>
+        <w:t xml:space="preserve">0.15</w:t>
       </w:r>
       <w:r>
         <w:tab/>
@@ -1744,7 +2146,7 @@
         <w:t xml:space="preserve">Inconsistencias</w:t>
       </w:r>
     </w:p>
-    <w:bookmarkStart w:id="32" w:name="X2a6384a16d09ba5f93ecc247053b08ca6070f54"/>
+    <w:bookmarkStart w:id="34" w:name="X2a6384a16d09ba5f93ecc247053b08ca6070f54"/>
     <w:p>
       <w:pPr>
         <w:pStyle w:val="Heading3"/>
@@ -1753,7 +2155,7 @@
         <w:rPr>
           <w:rStyle w:val="SectionNumber"/>
         </w:rPr>
-        <w:t xml:space="preserve">0.13.1</w:t>
+        <w:t xml:space="preserve">0.15.1</w:t>
       </w:r>
       <w:r>
         <w:tab/>
@@ -1870,8 +2272,8 @@
         <w:t xml:space="preserve">se uso.</w:t>
       </w:r>
     </w:p>
-    <w:bookmarkEnd w:id="32"/>
-    <w:bookmarkStart w:id="33" w:name="X51d57716ecd194516a4ccf4d08cf285a958b0ba"/>
+    <w:bookmarkEnd w:id="34"/>
+    <w:bookmarkStart w:id="35" w:name="X51d57716ecd194516a4ccf4d08cf285a958b0ba"/>
     <w:p>
       <w:pPr>
         <w:pStyle w:val="Heading3"/>
@@ -1880,7 +2282,7 @@
         <w:rPr>
           <w:rStyle w:val="SectionNumber"/>
         </w:rPr>
-        <w:t xml:space="preserve">0.13.2</w:t>
+        <w:t xml:space="preserve">0.15.2</w:t>
       </w:r>
       <w:r>
         <w:tab/>
@@ -1955,8 +2357,8 @@
         <w:t xml:space="preserve">medio.</w:t>
       </w:r>
     </w:p>
-    <w:bookmarkEnd w:id="33"/>
-    <w:bookmarkStart w:id="34" w:name="Xbadf0a57ac7c39b235818ef8ff96f0fb12df1e2"/>
+    <w:bookmarkEnd w:id="35"/>
+    <w:bookmarkStart w:id="36" w:name="Xbadf0a57ac7c39b235818ef8ff96f0fb12df1e2"/>
     <w:p>
       <w:pPr>
         <w:pStyle w:val="Heading3"/>
@@ -1965,7 +2367,7 @@
         <w:rPr>
           <w:rStyle w:val="SectionNumber"/>
         </w:rPr>
-        <w:t xml:space="preserve">0.13.3</w:t>
+        <w:t xml:space="preserve">0.15.3</w:t>
       </w:r>
       <w:r>
         <w:tab/>
@@ -2034,8 +2436,8 @@
         <w:t xml:space="preserve">como referencia.</w:t>
       </w:r>
     </w:p>
-    <w:bookmarkEnd w:id="34"/>
-    <w:bookmarkStart w:id="35" w:name="Xe2abe361c76148a6f952e92999330342922ce16"/>
+    <w:bookmarkEnd w:id="36"/>
+    <w:bookmarkStart w:id="37" w:name="Xe2abe361c76148a6f952e92999330342922ce16"/>
     <w:p>
       <w:pPr>
         <w:pStyle w:val="Heading3"/>
@@ -2044,7 +2446,7 @@
         <w:rPr>
           <w:rStyle w:val="SectionNumber"/>
         </w:rPr>
-        <w:t xml:space="preserve">0.13.4</w:t>
+        <w:t xml:space="preserve">0.15.4</w:t>
       </w:r>
       <w:r>
         <w:tab/>
@@ -2112,8 +2514,8 @@
         <w:t xml:space="preserve">no surte efecto.</w:t>
       </w:r>
     </w:p>
-    <w:bookmarkEnd w:id="35"/>
-    <w:bookmarkStart w:id="36" w:name="inc-05-repomix-output.xml-en-el-proyecto"/>
+    <w:bookmarkEnd w:id="37"/>
+    <w:bookmarkStart w:id="38" w:name="inc-05-repomix-output.xml-en-el-proyecto"/>
     <w:p>
       <w:pPr>
         <w:pStyle w:val="Heading3"/>
@@ -2122,7 +2524,7 @@
         <w:rPr>
           <w:rStyle w:val="SectionNumber"/>
         </w:rPr>
-        <w:t xml:space="preserve">0.13.5</w:t>
+        <w:t xml:space="preserve">0.15.5</w:t>
       </w:r>
       <w:r>
         <w:tab/>
@@ -2154,9 +2556,9 @@
         <w:t xml:space="preserve">1,2 MB de volcado de codigo. No es documentacion y se desactualiza solo.</w:t>
       </w:r>
     </w:p>
-    <w:bookmarkEnd w:id="36"/>
-    <w:bookmarkEnd w:id="37"/>
-    <w:bookmarkStart w:id="38" w:name="documentacion-faltante"/>
+    <w:bookmarkEnd w:id="38"/>
+    <w:bookmarkEnd w:id="39"/>
+    <w:bookmarkStart w:id="40" w:name="documentacion-faltante"/>
     <w:p>
       <w:pPr>
         <w:pStyle w:val="Heading2"/>
@@ -2165,7 +2567,7 @@
         <w:rPr>
           <w:rStyle w:val="SectionNumber"/>
         </w:rPr>
-        <w:t xml:space="preserve">0.14</w:t>
+        <w:t xml:space="preserve">0.16</w:t>
       </w:r>
       <w:r>
         <w:tab/>
@@ -2246,8 +2648,8 @@
         <w:t xml:space="preserve">(T-30).</w:t>
       </w:r>
     </w:p>
-    <w:bookmarkEnd w:id="38"/>
-    <w:bookmarkStart w:id="39" w:name="recomendaciones"/>
+    <w:bookmarkEnd w:id="40"/>
+    <w:bookmarkStart w:id="41" w:name="recomendaciones"/>
     <w:p>
       <w:pPr>
         <w:pStyle w:val="Heading2"/>
@@ -2256,7 +2658,7 @@
         <w:rPr>
           <w:rStyle w:val="SectionNumber"/>
         </w:rPr>
-        <w:t xml:space="preserve">0.15</w:t>
+        <w:t xml:space="preserve">0.17</w:t>
       </w:r>
       <w:r>
         <w:tab/>
@@ -2354,6 +2756,112 @@
               <w:jc w:val="left"/>
             </w:pPr>
             <w:r>
+              <w:t xml:space="preserve">SEC-00</w:t>
+            </w:r>
+          </w:p>
+        </w:tc>
+        <w:tc>
+          <w:tcPr/>
+          <w:p>
+            <w:pPr>
+              <w:pStyle w:val="Compact"/>
+              <w:jc w:val="left"/>
+            </w:pPr>
+            <w:r>
+              <w:rPr>
+                <w:b/>
+                <w:bCs/>
+              </w:rPr>
+              <w:t xml:space="preserve">Toma de cuentas</w:t>
+            </w:r>
+            <w:r>
+              <w:t xml:space="preserve">:</w:t>
+            </w:r>
+            <w:r>
+              <w:t xml:space="preserve"> </w:t>
+            </w:r>
+            <w:r>
+              <w:rPr>
+                <w:rStyle w:val="VerbatimChar"/>
+              </w:rPr>
+              <w:t xml:space="preserve">procesar_paswchg</w:t>
+            </w:r>
+            <w:r>
+              <w:t xml:space="preserve"> </w:t>
+            </w:r>
+            <w:r>
+              <w:t xml:space="preserve">publico y sin validar token</w:t>
+            </w:r>
+          </w:p>
+        </w:tc>
+        <w:tc>
+          <w:tcPr/>
+          <w:p>
+            <w:pPr>
+              <w:pStyle w:val="Compact"/>
+              <w:jc w:val="left"/>
+            </w:pPr>
+            <w:r>
+              <w:t xml:space="preserve">Seguridad</w:t>
+            </w:r>
+          </w:p>
+        </w:tc>
+        <w:tc>
+          <w:tcPr/>
+          <w:p>
+            <w:pPr>
+              <w:pStyle w:val="Compact"/>
+              <w:jc w:val="left"/>
+            </w:pPr>
+            <w:r>
+              <w:t xml:space="preserve">🔴</w:t>
+            </w:r>
+            <w:r>
+              <w:t xml:space="preserve"> </w:t>
+            </w:r>
+            <w:r>
+              <w:rPr>
+                <w:b/>
+                <w:bCs/>
+              </w:rPr>
+              <w:t xml:space="preserve">CRITICO</w:t>
+            </w:r>
+          </w:p>
+        </w:tc>
+        <w:tc>
+          <w:tcPr/>
+          <w:p>
+            <w:pPr>
+              <w:pStyle w:val="Compact"/>
+              <w:jc w:val="left"/>
+            </w:pPr>
+            <w:r>
+              <w:t xml:space="preserve">Validar el token, generarlo con</w:t>
+            </w:r>
+            <w:r>
+              <w:t xml:space="preserve"> </w:t>
+            </w:r>
+            <w:r>
+              <w:rPr>
+                <w:rStyle w:val="VerbatimChar"/>
+              </w:rPr>
+              <w:t xml:space="preserve">random_bytes</w:t>
+            </w:r>
+            <w:r>
+              <w:t xml:space="preserve">, no devolverlo en la respuesta, invalidarlo tras usarlo. Mitigacion inmediata: cerrar el acceso publico a esas dos rutas</w:t>
+            </w:r>
+          </w:p>
+        </w:tc>
+      </w:tr>
+      <w:tr>
+        <w:tc>
+          <w:tcPr/>
+          <w:p>
+            <w:pPr>
+              <w:pStyle w:val="Compact"/>
+              <w:jc w:val="left"/>
+            </w:pPr>
+            <w:r>
               <w:t xml:space="preserve">SEC-01</w:t>
             </w:r>
           </w:p>
@@ -3124,8 +3632,8 @@
         </w:tc>
       </w:tr>
     </w:tbl>
-    <w:bookmarkEnd w:id="39"/>
-    <w:bookmarkStart w:id="40" w:name="prioridad-recomendada"/>
+    <w:bookmarkEnd w:id="41"/>
+    <w:bookmarkStart w:id="42" w:name="prioridad-recomendada"/>
     <w:p>
       <w:pPr>
         <w:pStyle w:val="Heading2"/>
@@ -3134,7 +3642,7 @@
         <w:rPr>
           <w:rStyle w:val="SectionNumber"/>
         </w:rPr>
-        <w:t xml:space="preserve">0.16</w:t>
+        <w:t xml:space="preserve">0.18</w:t>
       </w:r>
       <w:r>
         <w:tab/>
@@ -3156,19 +3664,31 @@
           <w:b/>
           <w:bCs/>
         </w:rPr>
-        <w:t xml:space="preserve">CONT-02 — copiar el keystore fuera del servidor.</w:t>
-      </w:r>
-      <w:r>
-        <w:t xml:space="preserve"> </w:t>
-      </w:r>
-      <w:r>
-        <w:t xml:space="preserve">Toma minutos y su</w:t>
-      </w:r>
-      <w:r>
-        <w:t xml:space="preserve"> </w:t>
-      </w:r>
-      <w:r>
-        <w:t xml:space="preserve">perdida es irreversible.</w:t>
+        <w:t xml:space="preserve">SEC-00 — cerrar la toma de cuentas.</w:t>
+      </w:r>
+      <w:r>
+        <w:t xml:space="preserve"> </w:t>
+      </w:r>
+      <w:r>
+        <w:t xml:space="preserve">Hoy cualquiera en internet puede</w:t>
+      </w:r>
+      <w:r>
+        <w:t xml:space="preserve"> </w:t>
+      </w:r>
+      <w:r>
+        <w:t xml:space="preserve">hacerse con la cuenta administrativa de un sistema con 12.664 biometrias.</w:t>
+      </w:r>
+      <w:r>
+        <w:t xml:space="preserve"> </w:t>
+      </w:r>
+      <w:r>
+        <w:t xml:space="preserve">Va por delante de todo lo demas, incluido HTTPS: de nada sirve cifrar el</w:t>
+      </w:r>
+      <w:r>
+        <w:t xml:space="preserve"> </w:t>
+      </w:r>
+      <w:r>
+        <w:t xml:space="preserve">canal si la puerta esta abierta.</w:t>
       </w:r>
     </w:p>
     <w:p>
@@ -3184,19 +3704,19 @@
           <w:b/>
           <w:bCs/>
         </w:rPr>
-        <w:t xml:space="preserve">SEC-01 — activar HTTPS.</w:t>
-      </w:r>
-      <w:r>
-        <w:t xml:space="preserve"> </w:t>
-      </w:r>
-      <w:r>
-        <w:t xml:space="preserve">Ya esta preparado. Es biometria de 880 personas</w:t>
-      </w:r>
-      <w:r>
-        <w:t xml:space="preserve"> </w:t>
-      </w:r>
-      <w:r>
-        <w:t xml:space="preserve">viajando en claro por internet.</w:t>
+        <w:t xml:space="preserve">CONT-02 — copiar el keystore fuera del servidor.</w:t>
+      </w:r>
+      <w:r>
+        <w:t xml:space="preserve"> </w:t>
+      </w:r>
+      <w:r>
+        <w:t xml:space="preserve">Toma minutos y su</w:t>
+      </w:r>
+      <w:r>
+        <w:t xml:space="preserve"> </w:t>
+      </w:r>
+      <w:r>
+        <w:t xml:space="preserve">perdida es irreversible.</w:t>
       </w:r>
     </w:p>
     <w:p>
@@ -3212,19 +3732,25 @@
           <w:b/>
           <w:bCs/>
         </w:rPr>
-        <w:t xml:space="preserve">CONT-01 — respaldo.</w:t>
-      </w:r>
-      <w:r>
-        <w:t xml:space="preserve"> </w:t>
-      </w:r>
-      <w:r>
-        <w:t xml:space="preserve">El sistema con mas datos del servidor no tiene</w:t>
-      </w:r>
-      <w:r>
-        <w:t xml:space="preserve"> </w:t>
-      </w:r>
-      <w:r>
-        <w:t xml:space="preserve">ninguno.</w:t>
+        <w:t xml:space="preserve">SEC-01 — activar HTTPS.</w:t>
+      </w:r>
+      <w:r>
+        <w:t xml:space="preserve"> </w:t>
+      </w:r>
+      <w:r>
+        <w:t xml:space="preserve">Ya esta preparado en</w:t>
+      </w:r>
+      <w:r>
+        <w:t xml:space="preserve"> </w:t>
+      </w:r>
+      <w:r>
+        <w:rPr>
+          <w:rStyle w:val="VerbatimChar"/>
+        </w:rPr>
+        <w:t xml:space="preserve">docker-compose.prod.yml</w:t>
+      </w:r>
+      <w:r>
+        <w:t xml:space="preserve">.</w:t>
       </w:r>
     </w:p>
     <w:p>
@@ -3240,19 +3766,19 @@
           <w:b/>
           <w:bCs/>
         </w:rPr>
-        <w:t xml:space="preserve">MOV-01 — censo de tablets.</w:t>
-      </w:r>
-      <w:r>
-        <w:t xml:space="preserve"> </w:t>
-      </w:r>
-      <w:r>
-        <w:t xml:space="preserve">Una app de guardias sin boton de panico es un</w:t>
-      </w:r>
-      <w:r>
-        <w:t xml:space="preserve"> </w:t>
-      </w:r>
-      <w:r>
-        <w:t xml:space="preserve">riesgo operativo directo.</w:t>
+        <w:t xml:space="preserve">CONT-01 — respaldo.</w:t>
+      </w:r>
+      <w:r>
+        <w:t xml:space="preserve"> </w:t>
+      </w:r>
+      <w:r>
+        <w:t xml:space="preserve">El sistema con mas datos del servidor no tiene</w:t>
+      </w:r>
+      <w:r>
+        <w:t xml:space="preserve"> </w:t>
+      </w:r>
+      <w:r>
+        <w:t xml:space="preserve">ninguno.</w:t>
       </w:r>
     </w:p>
     <w:p>
@@ -3268,7 +3794,19 @@
           <w:b/>
           <w:bCs/>
         </w:rPr>
-        <w:t xml:space="preserve">SEC-05 / T-30 — aislamiento entre instituciones.</w:t>
+        <w:t xml:space="preserve">MOV-01 — censo de tablets.</w:t>
+      </w:r>
+      <w:r>
+        <w:t xml:space="preserve"> </w:t>
+      </w:r>
+      <w:r>
+        <w:t xml:space="preserve">Una app de guardias sin boton de panico es un</w:t>
+      </w:r>
+      <w:r>
+        <w:t xml:space="preserve"> </w:t>
+      </w:r>
+      <w:r>
+        <w:t xml:space="preserve">riesgo operativo directo.</w:t>
       </w:r>
     </w:p>
     <w:p>
@@ -3280,7 +3818,11 @@
         </w:numPr>
       </w:pPr>
       <w:r>
-        <w:t xml:space="preserve">SEC-02, INC-02, OPS-01.</w:t>
+        <w:rPr>
+          <w:b/>
+          <w:bCs/>
+        </w:rPr>
+        <w:t xml:space="preserve">SEC-05 / T-30 — aislamiento entre instituciones.</w:t>
       </w:r>
     </w:p>
     <w:p>
@@ -3292,7 +3834,7 @@
         </w:numPr>
       </w:pPr>
       <w:r>
-        <w:t xml:space="preserve">El resto.</w:t>
+        <w:t xml:space="preserve">SEC-02, INC-02, OPS-01 y el resto.</w:t>
       </w:r>
     </w:p>
     <w:p>
@@ -3321,8 +3863,8 @@
         </w:pict>
       </w:r>
     </w:p>
-    <w:bookmarkEnd w:id="40"/>
-    <w:bookmarkStart w:id="41" w:name="control-de-versiones"/>
+    <w:bookmarkEnd w:id="42"/>
+    <w:bookmarkStart w:id="43" w:name="control-de-versiones"/>
     <w:p>
       <w:pPr>
         <w:pStyle w:val="Heading2"/>
@@ -3331,7 +3873,7 @@
         <w:rPr>
           <w:rStyle w:val="SectionNumber"/>
         </w:rPr>
-        <w:t xml:space="preserve">0.17</w:t>
+        <w:t xml:space="preserve">0.19</w:t>
       </w:r>
       <w:r>
         <w:tab/>
@@ -3416,7 +3958,7 @@
               <w:jc w:val="left"/>
             </w:pPr>
             <w:r>
-              <w:t xml:space="preserve">1.0</w:t>
+              <w:t xml:space="preserve">1.1</w:t>
             </w:r>
           </w:p>
         </w:tc>
@@ -3484,7 +4026,7 @@
         <w:t xml:space="preserve">repositorio; la fuente es el archivo Markdown correspondiente.</w:t>
       </w:r>
     </w:p>
-    <w:bookmarkEnd w:id="41"/>
+    <w:bookmarkEnd w:id="43"/>
     <w:sectPr/>
   </w:body>
 </w:document>

</xml_diff>